<commit_message>
Added a sortable **Cost Eff.** column to the Planning Tanks list.
</commit_message>
<xml_diff>
--- a/Manual/VesselPlanner-Manual.docx
+++ b/Manual/VesselPlanner-Manual.docx
@@ -35,7 +35,7 @@
         </w:rPr>
       </w:pPr>
       <w:r>
-        <w:t>Version 0.6.43</w:t>
+        <w:t>Version 0.6.44</w:t>
       </w:r>
     </w:p>
     <w:p>
@@ -1468,6 +1468,14 @@
     <w:p>
       <w:pPr>
         <w:pStyle w:val="ListBullet"/>
+      </w:pPr>
+      <w:r>
+        <w:t>cost efficiency (kg of required-propellant capacity per Fund)</w:t>
+      </w:r>
+    </w:p>
+    <w:p>
+      <w:pPr>
+        <w:pStyle w:val="ListBullet"/>
         <w:rPr>
           <w:rFonts w:hint="eastAsia"/>
         </w:rPr>
@@ -1505,7 +1513,7 @@
         </w:rPr>
       </w:pPr>
       <w:r>
-        <w:t>Click a tank row to select it. The selected tank is highlighted and is also shown beneath the selected engine name.</w:t>
+        <w:t>Click a tank row to select it. The selected tank is highlighted and is also shown beneath the selected engine name. Cost Eff. is kilograms of required-propellant capacity per Fund and is sortable.</w:t>
       </w:r>
     </w:p>
     <w:tbl>

</xml_diff>

<commit_message>
Added part image and rotating preview of parts
</commit_message>
<xml_diff>
--- a/Manual/VesselPlanner-Manual.docx
+++ b/Manual/VesselPlanner-Manual.docx
@@ -35,7 +35,7 @@
         </w:rPr>
       </w:pPr>
       <w:r>
-        <w:t>Version 0.6.44</w:t>
+        <w:t>Version 0.7.43</w:t>
       </w:r>
     </w:p>
     <w:p>
@@ -98,87 +98,9 @@
             <w:r>
               <w:rPr>
                 <w:b/>
-                <w:noProof/>
-                <w:color w:val="58636E"/>
-                <w:sz w:val="22"/>
+                <w:i/>
               </w:rPr>
-              <w:drawing>
-                <wp:inline distT="0" distB="0" distL="0" distR="0" wp14:anchorId="51A65DEE" wp14:editId="62E4C313">
-                  <wp:extent cx="5897880" cy="4892675"/>
-                  <wp:effectExtent l="0" t="0" r="7620" b="3175"/>
-                  <wp:docPr id="1459129364" name="Picture 1"/>
-                  <wp:cNvGraphicFramePr>
-                    <a:graphicFrameLocks xmlns:a="http://schemas.openxmlformats.org/drawingml/2006/main" noChangeAspect="1"/>
-                  </wp:cNvGraphicFramePr>
-                  <a:graphic xmlns:a="http://schemas.openxmlformats.org/drawingml/2006/main">
-                    <a:graphicData uri="http://schemas.openxmlformats.org/drawingml/2006/picture">
-                      <pic:pic xmlns:pic="http://schemas.openxmlformats.org/drawingml/2006/picture">
-                        <pic:nvPicPr>
-                          <pic:cNvPr id="1459129364" name="Picture 1459129364"/>
-                          <pic:cNvPicPr/>
-                        </pic:nvPicPr>
-                        <pic:blipFill>
-                          <a:blip r:embed="rId8"/>
-                          <a:stretch>
-                            <a:fillRect/>
-                          </a:stretch>
-                        </pic:blipFill>
-                        <pic:spPr>
-                          <a:xfrm>
-                            <a:off x="0" y="0"/>
-                            <a:ext cx="5897880" cy="4892675"/>
-                          </a:xfrm>
-                          <a:prstGeom prst="rect">
-                            <a:avLst/>
-                          </a:prstGeom>
-                        </pic:spPr>
-                      </pic:pic>
-                    </a:graphicData>
-                  </a:graphic>
-                </wp:inline>
-              </w:drawing>
-            </w:r>
-            <w:r>
-              <w:rPr>
-                <w:b/>
-                <w:color w:val="58636E"/>
-                <w:sz w:val="22"/>
-              </w:rPr>
-              <w:br/>
-            </w:r>
-            <w:r>
-              <w:rPr>
-                <w:i/>
-                <w:color w:val="646C74"/>
-                <w:sz w:val="20"/>
-              </w:rPr>
-              <w:t xml:space="preserve">Main </w:t>
-            </w:r>
-            <w:proofErr w:type="spellStart"/>
-            <w:r>
-              <w:rPr>
-                <w:i/>
-                <w:color w:val="646C74"/>
-                <w:sz w:val="20"/>
-              </w:rPr>
-              <w:t>VesselPlanner</w:t>
-            </w:r>
-            <w:proofErr w:type="spellEnd"/>
-            <w:r>
-              <w:rPr>
-                <w:i/>
-                <w:color w:val="646C74"/>
-                <w:sz w:val="20"/>
-              </w:rPr>
-              <w:t xml:space="preserve"> window in the VAB/SPH</w:t>
-            </w:r>
-            <w:r>
-              <w:rPr>
-                <w:i/>
-                <w:color w:val="646C74"/>
-                <w:sz w:val="20"/>
-              </w:rPr>
-              <w:t xml:space="preserve"> (Analysis mode)</w:t>
+              <w:t>[IMAGE PLACEHOLDER: Main VesselPlanner window in the VAB/SPH (Analysis mode)]</w:t>
             </w:r>
           </w:p>
         </w:tc>
@@ -257,7 +179,6 @@
         <w:rPr>
           <w:b/>
         </w:rPr>
-        <w:lastRenderedPageBreak/>
         <w:t>ToolbarController</w:t>
       </w:r>
     </w:p>
@@ -560,71 +481,9 @@
             <w:r>
               <w:rPr>
                 <w:b/>
-                <w:noProof/>
-                <w:color w:val="58636E"/>
-                <w:sz w:val="22"/>
+                <w:i/>
               </w:rPr>
-              <w:drawing>
-                <wp:inline distT="0" distB="0" distL="0" distR="0" wp14:anchorId="3E7B0C37" wp14:editId="1DC538C0">
-                  <wp:extent cx="3531405" cy="2578687"/>
-                  <wp:effectExtent l="0" t="0" r="0" b="0"/>
-                  <wp:docPr id="1709617253" name="Picture 2"/>
-                  <wp:cNvGraphicFramePr>
-                    <a:graphicFrameLocks xmlns:a="http://schemas.openxmlformats.org/drawingml/2006/main" noChangeAspect="1"/>
-                  </wp:cNvGraphicFramePr>
-                  <a:graphic xmlns:a="http://schemas.openxmlformats.org/drawingml/2006/main">
-                    <a:graphicData uri="http://schemas.openxmlformats.org/drawingml/2006/picture">
-                      <pic:pic xmlns:pic="http://schemas.openxmlformats.org/drawingml/2006/picture">
-                        <pic:nvPicPr>
-                          <pic:cNvPr id="1709617253" name="Picture 1709617253"/>
-                          <pic:cNvPicPr/>
-                        </pic:nvPicPr>
-                        <pic:blipFill>
-                          <a:blip r:embed="rId9"/>
-                          <a:stretch>
-                            <a:fillRect/>
-                          </a:stretch>
-                        </pic:blipFill>
-                        <pic:spPr>
-                          <a:xfrm>
-                            <a:off x="0" y="0"/>
-                            <a:ext cx="3531405" cy="2578687"/>
-                          </a:xfrm>
-                          <a:prstGeom prst="rect">
-                            <a:avLst/>
-                          </a:prstGeom>
-                        </pic:spPr>
-                      </pic:pic>
-                    </a:graphicData>
-                  </a:graphic>
-                </wp:inline>
-              </w:drawing>
-            </w:r>
-            <w:r>
-              <w:rPr>
-                <w:b/>
-                <w:color w:val="58636E"/>
-                <w:sz w:val="22"/>
-              </w:rPr>
-              <w:br/>
-            </w:r>
-            <w:proofErr w:type="spellStart"/>
-            <w:r>
-              <w:rPr>
-                <w:i/>
-                <w:color w:val="646C74"/>
-                <w:sz w:val="20"/>
-              </w:rPr>
-              <w:t>GameData</w:t>
-            </w:r>
-            <w:proofErr w:type="spellEnd"/>
-            <w:r>
-              <w:rPr>
-                <w:i/>
-                <w:color w:val="646C74"/>
-                <w:sz w:val="20"/>
-              </w:rPr>
-              <w:t xml:space="preserve"> folder showing VesselPlanner and its dependencies</w:t>
+              <w:t>[IMAGE PLACEHOLDER: GameData folder showing VesselPlanner and its dependencies]</w:t>
             </w:r>
           </w:p>
         </w:tc>
@@ -671,12 +530,20 @@
         </w:rPr>
       </w:pPr>
       <w:r>
-        <w:t>The editor window has three operating modes:</w:t>
+        <w:t>The editor window has four operating modes:</w:t>
       </w:r>
     </w:p>
     <w:p>
       <w:pPr>
         <w:pStyle w:val="ListBullet"/>
+      </w:pPr>
+      <w:r>
+        <w:t>Mission Planner — build an ordered list of mission steps; each step is either an Engines &amp; Tanks maneuver or a Subassemblies step.</w:t>
+      </w:r>
+    </w:p>
+    <w:p>
+      <w:pPr>
+        <w:pStyle w:val="ListBullet"/>
         <w:rPr>
           <w:rFonts w:hint="eastAsia"/>
         </w:rPr>
@@ -685,6 +552,40 @@
         <w:rPr>
           <w:b/>
         </w:rPr>
+        <w:t>Stage-By-Stage</w:t>
+      </w:r>
+      <w:r>
+        <w:t xml:space="preserve"> — build and save a complete vessel plan one stage at a time.</w:t>
+      </w:r>
+    </w:p>
+    <w:p>
+      <w:pPr>
+        <w:pStyle w:val="ListBullet"/>
+        <w:rPr>
+          <w:rFonts w:hint="eastAsia"/>
+        </w:rPr>
+      </w:pPr>
+      <w:r>
+        <w:rPr>
+          <w:b/>
+        </w:rPr>
+        <w:t>Analyze Existing</w:t>
+      </w:r>
+      <w:r>
+        <w:t xml:space="preserve"> — inspect a stage already on the vessel and compare replacement engines.</w:t>
+      </w:r>
+    </w:p>
+    <w:p>
+      <w:pPr>
+        <w:pStyle w:val="ListBullet"/>
+        <w:rPr>
+          <w:rFonts w:hint="eastAsia"/>
+        </w:rPr>
+      </w:pPr>
+      <w:r>
+        <w:rPr>
+          <w:b/>
+        </w:rPr>
         <w:t>Planning</w:t>
       </w:r>
       <w:r>
@@ -694,35 +595,9 @@
     <w:p>
       <w:pPr>
         <w:pStyle w:val="ListBullet"/>
-        <w:rPr>
-          <w:rFonts w:hint="eastAsia"/>
-        </w:rPr>
-      </w:pPr>
-      <w:r>
-        <w:rPr>
-          <w:b/>
-        </w:rPr>
-        <w:t>Analyze Existing</w:t>
-      </w:r>
-      <w:r>
-        <w:t xml:space="preserve"> — inspect a stage already on the vessel and compare replacement engines.</w:t>
-      </w:r>
-    </w:p>
-    <w:p>
-      <w:pPr>
-        <w:pStyle w:val="ListBullet"/>
-        <w:rPr>
-          <w:rFonts w:hint="eastAsia"/>
-        </w:rPr>
-      </w:pPr>
-      <w:r>
-        <w:rPr>
-          <w:b/>
-        </w:rPr>
-        <w:t>Stage-By-Stage</w:t>
-      </w:r>
-      <w:r>
-        <w:t xml:space="preserve"> — build and save a complete vessel plan one stage at a time.</w:t>
+      </w:pPr>
+      <w:r>
+        <w:t>Mission Planner and Stage-By-Stage are grouped at the left of the mode-button row, followed by a gap before Analyze Existing and Planning.</w:t>
       </w:r>
     </w:p>
     <w:p>
@@ -730,7 +605,6 @@
         <w:pStyle w:val="Heading3"/>
       </w:pPr>
       <w:r>
-        <w:lastRenderedPageBreak/>
         <w:t>In Flight</w:t>
       </w:r>
     </w:p>
@@ -792,71 +666,9 @@
             <w:r>
               <w:rPr>
                 <w:b/>
-                <w:noProof/>
-                <w:color w:val="58636E"/>
-                <w:sz w:val="22"/>
+                <w:i/>
               </w:rPr>
-              <w:drawing>
-                <wp:inline distT="0" distB="0" distL="0" distR="0" wp14:anchorId="40F85405" wp14:editId="43C8896E">
-                  <wp:extent cx="361950" cy="361950"/>
-                  <wp:effectExtent l="0" t="0" r="0" b="0"/>
-                  <wp:docPr id="1488841119" name="Picture 3"/>
-                  <wp:cNvGraphicFramePr>
-                    <a:graphicFrameLocks xmlns:a="http://schemas.openxmlformats.org/drawingml/2006/main" noChangeAspect="1"/>
-                  </wp:cNvGraphicFramePr>
-                  <a:graphic xmlns:a="http://schemas.openxmlformats.org/drawingml/2006/main">
-                    <a:graphicData uri="http://schemas.openxmlformats.org/drawingml/2006/picture">
-                      <pic:pic xmlns:pic="http://schemas.openxmlformats.org/drawingml/2006/picture">
-                        <pic:nvPicPr>
-                          <pic:cNvPr id="1488841119" name="Picture 1488841119"/>
-                          <pic:cNvPicPr/>
-                        </pic:nvPicPr>
-                        <pic:blipFill>
-                          <a:blip r:embed="rId10"/>
-                          <a:stretch>
-                            <a:fillRect/>
-                          </a:stretch>
-                        </pic:blipFill>
-                        <pic:spPr>
-                          <a:xfrm>
-                            <a:off x="0" y="0"/>
-                            <a:ext cx="361950" cy="361950"/>
-                          </a:xfrm>
-                          <a:prstGeom prst="rect">
-                            <a:avLst/>
-                          </a:prstGeom>
-                        </pic:spPr>
-                      </pic:pic>
-                    </a:graphicData>
-                  </a:graphic>
-                </wp:inline>
-              </w:drawing>
-            </w:r>
-            <w:r>
-              <w:rPr>
-                <w:b/>
-                <w:color w:val="58636E"/>
-                <w:sz w:val="22"/>
-              </w:rPr>
-              <w:br/>
-            </w:r>
-            <w:proofErr w:type="spellStart"/>
-            <w:r>
-              <w:rPr>
-                <w:i/>
-                <w:color w:val="646C74"/>
-                <w:sz w:val="20"/>
-              </w:rPr>
-              <w:t>VesselPlanner</w:t>
-            </w:r>
-            <w:proofErr w:type="spellEnd"/>
-            <w:r>
-              <w:rPr>
-                <w:i/>
-                <w:color w:val="646C74"/>
-                <w:sz w:val="20"/>
-              </w:rPr>
-              <w:t xml:space="preserve"> toolbar button</w:t>
+              <w:t>[IMAGE PLACEHOLDER: VesselPlanner toolbar button]</w:t>
             </w:r>
           </w:p>
         </w:tc>
@@ -1038,11 +850,10 @@
         <w:rPr>
           <w:b/>
         </w:rPr>
-        <w:t>Body</w:t>
-      </w:r>
-      <w:r>
-        <w:t xml:space="preserve"> — celestial body used for gravity and atmospheric calculations.</w:t>
-      </w:r>
+        <w:t>Body — celestial body used for gravity and atmospheric calculations. Planning and Analyze Existing use the same shared ComboBox dropdown as Mission Planner; changing the body immediately refreshes the environment-dependent calculations. ComboBox popup entries use the same font, size, and style as normal buttons.</w:t>
+      </w:r>
+      <w:r/>
+      <w:r/>
     </w:p>
     <w:p>
       <w:pPr>
@@ -1144,62 +955,9 @@
             <w:r>
               <w:rPr>
                 <w:b/>
-                <w:noProof/>
-                <w:color w:val="58636E"/>
-                <w:sz w:val="22"/>
+                <w:i/>
               </w:rPr>
-              <w:lastRenderedPageBreak/>
-              <w:drawing>
-                <wp:inline distT="0" distB="0" distL="0" distR="0" wp14:anchorId="21CBBFFC" wp14:editId="3C8FD8C6">
-                  <wp:extent cx="5897880" cy="4892675"/>
-                  <wp:effectExtent l="0" t="0" r="7620" b="3175"/>
-                  <wp:docPr id="1734597708" name="Picture 4"/>
-                  <wp:cNvGraphicFramePr>
-                    <a:graphicFrameLocks xmlns:a="http://schemas.openxmlformats.org/drawingml/2006/main" noChangeAspect="1"/>
-                  </wp:cNvGraphicFramePr>
-                  <a:graphic xmlns:a="http://schemas.openxmlformats.org/drawingml/2006/main">
-                    <a:graphicData uri="http://schemas.openxmlformats.org/drawingml/2006/picture">
-                      <pic:pic xmlns:pic="http://schemas.openxmlformats.org/drawingml/2006/picture">
-                        <pic:nvPicPr>
-                          <pic:cNvPr id="1734597708" name="Picture 1734597708"/>
-                          <pic:cNvPicPr/>
-                        </pic:nvPicPr>
-                        <pic:blipFill>
-                          <a:blip r:embed="rId11"/>
-                          <a:stretch>
-                            <a:fillRect/>
-                          </a:stretch>
-                        </pic:blipFill>
-                        <pic:spPr>
-                          <a:xfrm>
-                            <a:off x="0" y="0"/>
-                            <a:ext cx="5897880" cy="4892675"/>
-                          </a:xfrm>
-                          <a:prstGeom prst="rect">
-                            <a:avLst/>
-                          </a:prstGeom>
-                        </pic:spPr>
-                      </pic:pic>
-                    </a:graphicData>
-                  </a:graphic>
-                </wp:inline>
-              </w:drawing>
-            </w:r>
-            <w:r>
-              <w:rPr>
-                <w:b/>
-                <w:color w:val="58636E"/>
-                <w:sz w:val="22"/>
-              </w:rPr>
-              <w:br/>
-            </w:r>
-            <w:r>
-              <w:rPr>
-                <w:i/>
-                <w:color w:val="646C74"/>
-                <w:sz w:val="20"/>
-              </w:rPr>
-              <w:t>Planning Requirements pane with sample values</w:t>
+              <w:t>[IMAGE PLACEHOLDER: Planning Requirements pane with sample values]</w:t>
             </w:r>
           </w:p>
         </w:tc>
@@ -1247,7 +1005,10 @@
         </w:rPr>
       </w:pPr>
       <w:r>
-        <w:t>VesselPlanner tests compatible engines and engine counts and fills the candidate engine list.</w:t>
+        <w:t>VesselPlanner tests compatible engines and engine counts and fills the candidate engine list. The candidate-engine Filter and Exclude fields are live: each accepts comma-separated terms. Filter terms use OR matching against the localized display name or internal part name; any matching Exclude term hides the engine.</w:t>
+      </w:r>
+      <w:r>
+        <w:t xml:space="preserve"> Each engine row includes a KSP part thumbnail.</w:t>
       </w:r>
     </w:p>
     <w:p>
@@ -1326,62 +1087,9 @@
             <w:r>
               <w:rPr>
                 <w:b/>
-                <w:noProof/>
-                <w:color w:val="58636E"/>
-                <w:sz w:val="22"/>
+                <w:i/>
               </w:rPr>
-              <w:lastRenderedPageBreak/>
-              <w:drawing>
-                <wp:inline distT="0" distB="0" distL="0" distR="0" wp14:anchorId="6BD4EE36" wp14:editId="44B48887">
-                  <wp:extent cx="5322857" cy="3702857"/>
-                  <wp:effectExtent l="0" t="0" r="0" b="0"/>
-                  <wp:docPr id="75230850" name="Picture 5"/>
-                  <wp:cNvGraphicFramePr>
-                    <a:graphicFrameLocks xmlns:a="http://schemas.openxmlformats.org/drawingml/2006/main" noChangeAspect="1"/>
-                  </wp:cNvGraphicFramePr>
-                  <a:graphic xmlns:a="http://schemas.openxmlformats.org/drawingml/2006/main">
-                    <a:graphicData uri="http://schemas.openxmlformats.org/drawingml/2006/picture">
-                      <pic:pic xmlns:pic="http://schemas.openxmlformats.org/drawingml/2006/picture">
-                        <pic:nvPicPr>
-                          <pic:cNvPr id="75230850" name="Picture 75230850"/>
-                          <pic:cNvPicPr/>
-                        </pic:nvPicPr>
-                        <pic:blipFill>
-                          <a:blip r:embed="rId12"/>
-                          <a:stretch>
-                            <a:fillRect/>
-                          </a:stretch>
-                        </pic:blipFill>
-                        <pic:spPr>
-                          <a:xfrm>
-                            <a:off x="0" y="0"/>
-                            <a:ext cx="5322857" cy="3702857"/>
-                          </a:xfrm>
-                          <a:prstGeom prst="rect">
-                            <a:avLst/>
-                          </a:prstGeom>
-                        </pic:spPr>
-                      </pic:pic>
-                    </a:graphicData>
-                  </a:graphic>
-                </wp:inline>
-              </w:drawing>
-            </w:r>
-            <w:r>
-              <w:rPr>
-                <w:b/>
-                <w:color w:val="58636E"/>
-                <w:sz w:val="22"/>
-              </w:rPr>
-              <w:br/>
-            </w:r>
-            <w:r>
-              <w:rPr>
-                <w:i/>
-                <w:color w:val="646C74"/>
-                <w:sz w:val="20"/>
-              </w:rPr>
-              <w:t>Candidate engine list and Selected Engine pane</w:t>
+              <w:t>[IMAGE PLACEHOLDER: Candidate engine list and Selected Engine pane]</w:t>
             </w:r>
           </w:p>
         </w:tc>
@@ -1410,16 +1118,10 @@
         </w:rPr>
       </w:pPr>
       <w:r>
-        <w:t xml:space="preserve">The </w:t>
-      </w:r>
-      <w:r>
-        <w:rPr>
-          <w:b/>
-        </w:rPr>
-        <w:t>Tanks</w:t>
-      </w:r>
-      <w:r>
-        <w:t xml:space="preserve"> pane shows tank combinations that can hold the required propellant.</w:t>
+        <w:t>The Tanks pane shows tank sets that can hold the required propellant. VesselPlanner evaluates sets containing one, two, or three different tank types. Every tank type in a set must share the same KSP bulkhead profile. The Filter and Exclude fields are on the same row above the tank table, matching the engine-filter layout. Both accept comma-separated terms. Filter terms use OR matching against any tank display name or internal part name in the set; if any Exclude term matches any tank in the set, the entire suggestion is hidden. VesselPlanner only offers storage parts that have both top and bottom attach nodes as tank candidates.</w:t>
+      </w:r>
+      <w:r>
+        <w:t xml:space="preserve"> Each tank-set row shows a thumbnail for every tank type in the set.</w:t>
       </w:r>
     </w:p>
     <w:p>
@@ -1440,7 +1142,7 @@
         </w:rPr>
       </w:pPr>
       <w:r>
-        <w:t>tank name</w:t>
+        <w:t>tank set, including the count of each tank type</w:t>
       </w:r>
     </w:p>
     <w:p>
@@ -1451,7 +1153,7 @@
         </w:rPr>
       </w:pPr>
       <w:r>
-        <w:t>number required</w:t>
+        <w:t>total number of tanks</w:t>
       </w:r>
     </w:p>
     <w:p>
@@ -1462,15 +1164,18 @@
         </w:rPr>
       </w:pPr>
       <w:r>
-        <w:t>dry mass</w:t>
+        <w:t>total tank dry mass</w:t>
       </w:r>
     </w:p>
     <w:p>
       <w:pPr>
         <w:pStyle w:val="ListBullet"/>
-      </w:pPr>
-      <w:r>
-        <w:t>cost efficiency (kg of required-propellant capacity per Fund)</w:t>
+        <w:rPr>
+          <w:rFonts w:hint="eastAsia"/>
+        </w:rPr>
+      </w:pPr>
+      <w:r>
+        <w:t>excess capacity</w:t>
       </w:r>
     </w:p>
     <w:p>
@@ -1481,7 +1186,7 @@
         </w:rPr>
       </w:pPr>
       <w:r>
-        <w:t>excess capacity</w:t>
+        <w:t>total supplied capacity</w:t>
       </w:r>
     </w:p>
     <w:p>
@@ -1492,28 +1197,17 @@
         </w:rPr>
       </w:pPr>
       <w:r>
-        <w:t>total capacity</w:t>
-      </w:r>
-    </w:p>
-    <w:p>
-      <w:pPr>
-        <w:pStyle w:val="ListBullet"/>
-        <w:rPr>
-          <w:rFonts w:hint="eastAsia"/>
-        </w:rPr>
-      </w:pPr>
-      <w:r>
-        <w:t>KSP bulkhead profile</w:t>
-      </w:r>
-    </w:p>
-    <w:p>
-      <w:pPr>
-        <w:rPr>
-          <w:rFonts w:hint="eastAsia"/>
-        </w:rPr>
-      </w:pPr>
-      <w:r>
-        <w:t>Click a tank row to select it. The selected tank is highlighted and is also shown beneath the selected engine name. Cost Eff. is kilograms of required-propellant capacity per Fund and is sortable.</w:t>
+        <w:t>shared KSP bulkhead profile</w:t>
+      </w:r>
+    </w:p>
+    <w:p>
+      <w:pPr>
+        <w:rPr>
+          <w:rFonts w:hint="eastAsia"/>
+        </w:rPr>
+      </w:pPr>
+      <w:r>
+        <w:t>Click a tank-set row to select it. The selected set is highlighted and is also shown beneath the selected engine name.</w:t>
       </w:r>
     </w:p>
     <w:tbl>
@@ -1555,62 +1249,9 @@
             <w:r>
               <w:rPr>
                 <w:b/>
-                <w:noProof/>
-                <w:color w:val="58636E"/>
-                <w:sz w:val="22"/>
+                <w:i/>
               </w:rPr>
-              <w:lastRenderedPageBreak/>
-              <w:drawing>
-                <wp:inline distT="0" distB="0" distL="0" distR="0" wp14:anchorId="3F103D8D" wp14:editId="0A008DB0">
-                  <wp:extent cx="5897880" cy="2534285"/>
-                  <wp:effectExtent l="0" t="0" r="7620" b="0"/>
-                  <wp:docPr id="736747995" name="Picture 6"/>
-                  <wp:cNvGraphicFramePr>
-                    <a:graphicFrameLocks xmlns:a="http://schemas.openxmlformats.org/drawingml/2006/main" noChangeAspect="1"/>
-                  </wp:cNvGraphicFramePr>
-                  <a:graphic xmlns:a="http://schemas.openxmlformats.org/drawingml/2006/main">
-                    <a:graphicData uri="http://schemas.openxmlformats.org/drawingml/2006/picture">
-                      <pic:pic xmlns:pic="http://schemas.openxmlformats.org/drawingml/2006/picture">
-                        <pic:nvPicPr>
-                          <pic:cNvPr id="736747995" name="Picture 736747995"/>
-                          <pic:cNvPicPr/>
-                        </pic:nvPicPr>
-                        <pic:blipFill>
-                          <a:blip r:embed="rId13"/>
-                          <a:stretch>
-                            <a:fillRect/>
-                          </a:stretch>
-                        </pic:blipFill>
-                        <pic:spPr>
-                          <a:xfrm>
-                            <a:off x="0" y="0"/>
-                            <a:ext cx="5897880" cy="2534285"/>
-                          </a:xfrm>
-                          <a:prstGeom prst="rect">
-                            <a:avLst/>
-                          </a:prstGeom>
-                        </pic:spPr>
-                      </pic:pic>
-                    </a:graphicData>
-                  </a:graphic>
-                </wp:inline>
-              </w:drawing>
-            </w:r>
-            <w:r>
-              <w:rPr>
-                <w:b/>
-                <w:color w:val="58636E"/>
-                <w:sz w:val="22"/>
-              </w:rPr>
-              <w:br/>
-            </w:r>
-            <w:r>
-              <w:rPr>
-                <w:i/>
-                <w:color w:val="646C74"/>
-                <w:sz w:val="20"/>
-              </w:rPr>
-              <w:t>Tanks pane with one tank row selected</w:t>
+              <w:t>[IMAGE PLACEHOLDER: Tanks pane with one tank row selected]</w:t>
             </w:r>
           </w:p>
         </w:tc>
@@ -1687,20 +1328,18 @@
         <w:rPr>
           <w:b/>
         </w:rPr>
-        <w:t>Add Tank</w:t>
-      </w:r>
-      <w:r>
-        <w:t xml:space="preserve"> — selects one copy of that tank for placement.</w:t>
-      </w:r>
-    </w:p>
-    <w:p>
-      <w:pPr>
-        <w:rPr>
-          <w:rFonts w:hint="eastAsia"/>
-        </w:rPr>
-      </w:pPr>
-      <w:r>
-        <w:t>When a Stage-By-Stage stage is open, these buttons add the selected parts to the plan instead of placing them directly on the editor cursor.</w:t>
+        <w:t>Add Tank / Add Set — in normal Planning, a one-type suggestion selects one tank for placement; a mixed set starts with the first tank type and reports the complete set and counts.</w:t>
+      </w:r>
+      <w:r/>
+    </w:p>
+    <w:p>
+      <w:pPr>
+        <w:rPr>
+          <w:rFonts w:hint="eastAsia"/>
+        </w:rPr>
+      </w:pPr>
+      <w:r>
+        <w:t>When a Stage-By-Stage stage is open, every tank-row action is labeled Add to Stage for both one-type and mixed tank sets. It records the complete selected tank set in the current stage. Add Engine &amp; Tanks records the selected engine and the complete selected tank set together.</w:t>
       </w:r>
     </w:p>
     <w:p>
@@ -1778,6 +1417,12 @@
       </w:r>
     </w:p>
     <w:p>
+      <w:pPr/>
+      <w:r>
+        <w:t>The Planet / body selector uses the same shared ComboBox dropdown as Planning and Mission Planner. Changing the body still clamps altitude to the valid atmosphere range and recalculates the simulation environment immediately.</w:t>
+      </w:r>
+    </w:p>
+    <w:p>
       <w:pPr>
         <w:pStyle w:val="Heading3"/>
       </w:pPr>
@@ -1845,7 +1490,7 @@
         </w:rPr>
       </w:pPr>
       <w:r>
-        <w:t>engine filters</w:t>
+        <w:t>engine Filter / Exclude text fields</w:t>
       </w:r>
     </w:p>
     <w:p>
@@ -1899,6 +1544,9 @@
       <w:r>
         <w:t xml:space="preserve"> pane summarizes the selected stage. Depending on your Settings choices, it can show:</w:t>
       </w:r>
+      <w:r>
+        <w:t xml:space="preserve"> Current-engine rows include the installed KSP part thumbnail.</w:t>
+      </w:r>
     </w:p>
     <w:p>
       <w:pPr>
@@ -1908,7 +1556,6 @@
         </w:rPr>
       </w:pPr>
       <w:r>
-        <w:lastRenderedPageBreak/>
         <w:t>craft wet and dry mass</w:t>
       </w:r>
     </w:p>
@@ -2039,61 +1686,9 @@
             <w:r>
               <w:rPr>
                 <w:b/>
-                <w:noProof/>
-                <w:color w:val="58636E"/>
-                <w:sz w:val="22"/>
+                <w:i/>
               </w:rPr>
-              <w:drawing>
-                <wp:inline distT="0" distB="0" distL="0" distR="0" wp14:anchorId="0815F0FF" wp14:editId="59004FDB">
-                  <wp:extent cx="5897880" cy="4892675"/>
-                  <wp:effectExtent l="0" t="0" r="7620" b="3175"/>
-                  <wp:docPr id="861414282" name="Picture 7"/>
-                  <wp:cNvGraphicFramePr>
-                    <a:graphicFrameLocks xmlns:a="http://schemas.openxmlformats.org/drawingml/2006/main" noChangeAspect="1"/>
-                  </wp:cNvGraphicFramePr>
-                  <a:graphic xmlns:a="http://schemas.openxmlformats.org/drawingml/2006/main">
-                    <a:graphicData uri="http://schemas.openxmlformats.org/drawingml/2006/picture">
-                      <pic:pic xmlns:pic="http://schemas.openxmlformats.org/drawingml/2006/picture">
-                        <pic:nvPicPr>
-                          <pic:cNvPr id="861414282" name="Picture 861414282"/>
-                          <pic:cNvPicPr/>
-                        </pic:nvPicPr>
-                        <pic:blipFill>
-                          <a:blip r:embed="rId8"/>
-                          <a:stretch>
-                            <a:fillRect/>
-                          </a:stretch>
-                        </pic:blipFill>
-                        <pic:spPr>
-                          <a:xfrm>
-                            <a:off x="0" y="0"/>
-                            <a:ext cx="5897880" cy="4892675"/>
-                          </a:xfrm>
-                          <a:prstGeom prst="rect">
-                            <a:avLst/>
-                          </a:prstGeom>
-                        </pic:spPr>
-                      </pic:pic>
-                    </a:graphicData>
-                  </a:graphic>
-                </wp:inline>
-              </w:drawing>
-            </w:r>
-            <w:r>
-              <w:rPr>
-                <w:b/>
-                <w:color w:val="58636E"/>
-                <w:sz w:val="22"/>
-              </w:rPr>
-              <w:br/>
-            </w:r>
-            <w:r>
-              <w:rPr>
-                <w:i/>
-                <w:color w:val="646C74"/>
-                <w:sz w:val="20"/>
-              </w:rPr>
-              <w:t>Analyze Existing mode showing Simulation Environment and Existing Stage panes</w:t>
+              <w:t>[IMAGE PLACEHOLDER: Analyze Existing mode showing Simulation Environment and Existing Stage panes]</w:t>
             </w:r>
           </w:p>
         </w:tc>
@@ -2122,7 +1717,10 @@
         </w:rPr>
       </w:pPr>
       <w:r>
-        <w:t>The right side lists engines that can be simulated against the current stage.</w:t>
+        <w:t>The right side lists engines that can be simulated against the current stage. Engine display names use KSP localization when a localized part title is available. Use Filter to include engines by comma-separated display/internal-name terms and Exclude to remove any engine matching a comma-separated exclusion term.</w:t>
+      </w:r>
+      <w:r>
+        <w:t xml:space="preserve"> Candidate rows include the KSP engine-part thumbnail.</w:t>
       </w:r>
     </w:p>
     <w:p>
@@ -2153,7 +1751,7 @@
         </w:rPr>
       </w:pPr>
       <w:r>
-        <w:t>engine-name search</w:t>
+        <w:t>Filter / Exclude — live, case-insensitive, comma-separated engine name searches</w:t>
       </w:r>
     </w:p>
     <w:p>
@@ -2181,7 +1779,6 @@
         <w:rPr>
           <w:b/>
         </w:rPr>
-        <w:lastRenderedPageBreak/>
         <w:t>Ignore monopropellant</w:t>
       </w:r>
     </w:p>
@@ -2339,7 +1936,7 @@
               <w:rPr>
                 <w:sz w:val="18"/>
               </w:rPr>
-              <w:t>Engine part name</w:t>
+              <w:t>KSP-localized engine part title when available</w:t>
             </w:r>
           </w:p>
         </w:tc>
@@ -3157,7 +2754,102 @@
         <w:pStyle w:val="Heading1"/>
       </w:pPr>
       <w:r>
-        <w:lastRenderedPageBreak/>
+        <w:t>Mission Planning</w:t>
+      </w:r>
+    </w:p>
+    <w:p>
+      <w:pPr>
+        <w:pStyle w:val="Heading2"/>
+      </w:pPr>
+      <w:r>
+        <w:t>7. Mission Planner</w:t>
+      </w:r>
+    </w:p>
+    <w:p>
+      <w:pPr/>
+      <w:r>
+        <w:t>Select Mission Planner at the top of the editor window to build an ordered mission-step list. It uses the same main-window skin and background as the other VesselPlanner editor modes. Each new step begins with a Step type choice: Engines &amp; Tanks or Subassemblies. The two types are mutually exclusive.</w:t>
+      </w:r>
+    </w:p>
+    <w:p>
+      <w:pPr/>
+      <w:r>
+        <w:t>Each row shows either an Engines &amp; Tanks maneuver step or a Subassemblies step. Engines &amp; Tanks rows show maneuver, body or route, required delta-v, and ASL or VAC basis. Subassemblies rows show their selected-subassembly summary and no delta-v requirement. Double-click a row to edit that step. Row actions provide Insert Above, Insert Below, Move Up, Move Down, and a red X Delete control. The bottom Add New Step button appends a new step. The Add/Edit Mission Step window can be dragged from anywhere in the window.</w:t>
+      </w:r>
+      <w:r/>
+    </w:p>
+    <w:p>
+      <w:pPr/>
+      <w:r>
+        <w:t>Mission Planner starts with Unnamed Mission as the initial mission name. Enter a different Mission name if desired. Save writes the ordered step list to GameData/VesselPlanner/PluginData/MissionPlans/&lt;Mission name&gt;.cfg. Load restores the mission name, each step type, all Engines &amp; Tanks maneuver settings, and every Subassemblies-step entry, Count, Decoupler selection, stored unit mass, and per-copy decoupler mass. Mission files saved before step types were introduced load as Engines &amp; Tanks steps by default.</w:t>
+      </w:r>
+      <w:r/>
+    </w:p>
+    <w:p>
+      <w:pPr>
+        <w:pStyle w:val="Heading3"/>
+      </w:pPr>
+      <w:r>
+        <w:t>Maneuver entry</w:t>
+      </w:r>
+    </w:p>
+    <w:p>
+      <w:pPr/>
+      <w:r>
+        <w:t>The maneuver drop-down uses readable labels with spaces, including Launch, Sub Orbital Launch, Resource Transfer, Transfer To Another Planet, Change Both Pe And Ap, Fine Tune Closest Approach, Match Velocities With Vessel, and Return From A Moon. The underlying maneuver enum values are unchanged so existing saved missions remain compatible.</w:t>
+      </w:r>
+    </w:p>
+    <w:p>
+      <w:pPr>
+        <w:pStyle w:val="Heading3"/>
+      </w:pPr>
+      <w:r>
+        <w:t>Body selection</w:t>
+      </w:r>
+    </w:p>
+    <w:p>
+      <w:pPr/>
+      <w:r>
+        <w:t>Launch and Sub Orbital Launch default the body dropdown to KSP's home body when there is no earlier Landing, or to the body from the most recent earlier Landing. The user may then choose another body. When adding Landing, its body defaults to the most recently specified body in earlier mission steps; if the latest applicable step is Transfer To Another Planet, its destination is used. The user may then choose another landing body. Orbit/landing and orbital-change maneuvers select one body. Transfer To Another Planet selects only the destination; its source is read-only and comes from the immediately preceding maneuver, or from that maneuver's destination if it is also a transfer. The Source body display uses a fixed 30 px height to match the surrounding Add/Edit Mission Step controls. A transfer requires a preceding maneuver with a body. Return From A Moon lists only moons from the active delta-v CSV and automatically loads a CSV-derived Needed delta-v. Every maneuver has editable needed delta-v and an ASL or VAC basis.</w:t>
+      </w:r>
+    </w:p>
+    <w:p>
+      <w:pPr>
+        <w:pStyle w:val="Heading3"/>
+      </w:pPr>
+      <w:r>
+        <w:t>Delta-v table</w:t>
+      </w:r>
+    </w:p>
+    <w:p>
+      <w:pPr/>
+      <w:r>
+        <w:t>Mission Planner detects the active planet pack and loads body and route data from:</w:t>
+      </w:r>
+    </w:p>
+    <w:p>
+      <w:pPr/>
+      <w:r>
+        <w:t>GameData/VesselPlanner/PluginData/DeltaVTables/&lt;packName&gt;.csv</w:t>
+      </w:r>
+    </w:p>
+    <w:p>
+      <w:pPr/>
+      <w:r>
+        <w:t>CSV columns: Origin, Destination, dV_to_low_orbit, ejection_dV, capture_dV, transfer_to_low_orbit_dV, total_capture_dV, dV_low_orbit_to_surface, ascent_dV, plane_change_dV, parent, isMoon, order.</w:t>
+      </w:r>
+    </w:p>
+    <w:p>
+      <w:pPr/>
+      <w:r>
+        <w:t>When Mission Planner initializes, VesselPlanner detects the active planet pack. Known packs use the PlanetPackKind name; a single unknown custom pack uses its detected GameData folder name. It then loads &lt;packName&gt;.csv. Stock.csv, JNSQ.csv, GPP.csv, and RSS.csv are included starter tables. When a matching row exists, Launch/Sub Orbital Launch uses dV_to_low_orbit for the selected launch body, Transfer To Another Planet uses total_capture_dV, and Landing/Splashdown uses dV_low_orbit_to_surface. Return From A Moon uses the selected moon self-row's ascent_dV (falling back to dV_to_low_orbit) plus the matching parent-to-moon row's capture_dV as the reverse moon-escape leg. For the stock table, Mun is 580 + 310 = 890 m/s and Minmus is 180 + 160 = 340 m/s. The suggestion remains editable. For transfers, the Clipboard delta-v dropdown maps directly to the clipboard fields: Ejection reads Ejection delta-v, Insertion reads Insertion delta-v, and Total reads Total delta-v. Changing the choice immediately replaces Needed delta-v with the selected value from a matching clipboard route.</w:t>
+      </w:r>
+    </w:p>
+    <w:p>
+      <w:pPr>
+        <w:pStyle w:val="Heading1"/>
+      </w:pPr>
+      <w:r>
         <w:t>Stage-By-Stage Instructions</w:t>
       </w:r>
     </w:p>
@@ -3185,7 +2877,7 @@
         <w:pStyle w:val="Heading2"/>
       </w:pPr>
       <w:r>
-        <w:t>7. Creating a Stage-By-Stage Plan</w:t>
+        <w:t>8. Creating a Stage-By-Stage Plan</w:t>
       </w:r>
     </w:p>
     <w:p>
@@ -3246,61 +2938,9 @@
             <w:r>
               <w:rPr>
                 <w:b/>
-                <w:noProof/>
-                <w:color w:val="58636E"/>
-                <w:sz w:val="22"/>
+                <w:i/>
               </w:rPr>
-              <w:drawing>
-                <wp:inline distT="0" distB="0" distL="0" distR="0" wp14:anchorId="21F46E1D" wp14:editId="7276B3B9">
-                  <wp:extent cx="5897880" cy="3827145"/>
-                  <wp:effectExtent l="0" t="0" r="7620" b="1905"/>
-                  <wp:docPr id="949980059" name="Picture 8"/>
-                  <wp:cNvGraphicFramePr>
-                    <a:graphicFrameLocks xmlns:a="http://schemas.openxmlformats.org/drawingml/2006/main" noChangeAspect="1"/>
-                  </wp:cNvGraphicFramePr>
-                  <a:graphic xmlns:a="http://schemas.openxmlformats.org/drawingml/2006/main">
-                    <a:graphicData uri="http://schemas.openxmlformats.org/drawingml/2006/picture">
-                      <pic:pic xmlns:pic="http://schemas.openxmlformats.org/drawingml/2006/picture">
-                        <pic:nvPicPr>
-                          <pic:cNvPr id="949980059" name="Picture 949980059"/>
-                          <pic:cNvPicPr/>
-                        </pic:nvPicPr>
-                        <pic:blipFill>
-                          <a:blip r:embed="rId14"/>
-                          <a:stretch>
-                            <a:fillRect/>
-                          </a:stretch>
-                        </pic:blipFill>
-                        <pic:spPr>
-                          <a:xfrm>
-                            <a:off x="0" y="0"/>
-                            <a:ext cx="5897880" cy="3827145"/>
-                          </a:xfrm>
-                          <a:prstGeom prst="rect">
-                            <a:avLst/>
-                          </a:prstGeom>
-                        </pic:spPr>
-                      </pic:pic>
-                    </a:graphicData>
-                  </a:graphic>
-                </wp:inline>
-              </w:drawing>
-            </w:r>
-            <w:r>
-              <w:rPr>
-                <w:b/>
-                <w:color w:val="58636E"/>
-                <w:sz w:val="22"/>
-              </w:rPr>
-              <w:br/>
-            </w:r>
-            <w:r>
-              <w:rPr>
-                <w:i/>
-                <w:color w:val="646C74"/>
-                <w:sz w:val="20"/>
-              </w:rPr>
-              <w:t>Stage-By-Stage Plan window</w:t>
+              <w:t>[IMAGE PLACEHOLDER: Stage-By-Stage Plan window]</w:t>
             </w:r>
           </w:p>
         </w:tc>
@@ -3416,6 +3056,12 @@
       </w:r>
     </w:p>
     <w:p>
+      <w:pPr/>
+      <w:r>
+        <w:t>Use Select Mission Plan to choose a mission saved from Mission Planner. The Stage-By-Stage plan name is immediately set to the selected mission plan name and remains editable. The mission appears in a dedicated left-justified list along the left side of the Stage-By-Stage window, with the last mission step at the top. Clicking an Engines &amp; Tanks step opens an Engines &amp; Tanks stage with its Target delta-v and ASL/VAC basis prefilled. Clicking a Subassemblies step opens a Subassemblies stage with every selected subassembly, Count, and Decoupler setting copied directly into the editable list. A mission step therefore never creates a stage containing both propulsion parts and subassemblies. If that mission step already has a linked stage, clicking it opens the existing stage for editing instead of creating a duplicate. When Calculate is used on an Engines &amp; Tanks mission-linked stage, VesselPlanner still derives the Planning body/environment from the mission history.</w:t>
+      </w:r>
+    </w:p>
+    <w:p>
       <w:pPr>
         <w:rPr>
           <w:rFonts w:hint="eastAsia"/>
@@ -3444,7 +3090,6 @@
         </w:rPr>
       </w:pPr>
       <w:r>
-        <w:lastRenderedPageBreak/>
         <w:t>if the editor is empty, VesselPlanner uses 5.0 t.</w:t>
       </w:r>
     </w:p>
@@ -3492,7 +3137,7 @@
         </w:rPr>
       </w:pPr>
       <w:r>
-        <w:t>The New Stage dialog opens immediately to the right of the Stage-By-Stage Plan window, with both top edges aligned and the dialog's left edge adjacent to the plan window's right edge.</w:t>
+        <w:t>The New Stage dialog opens immediately to the right of the Stage-By-Stage Plan window, with both top edges aligned and the dialog's left edge adjacent to the plan window's right edge. The dialog is slightly taller in both Engines &amp; Tanks and Subassemblies modes to provide more room for the stage controls and status text.</w:t>
       </w:r>
     </w:p>
     <w:p>
@@ -3512,35 +3157,17 @@
         </w:rPr>
       </w:pPr>
       <w:r>
-        <w:t xml:space="preserve">The New Stage dialog is modal. Other VesselPlanner windows cannot be used until you click </w:t>
-      </w:r>
-      <w:r>
-        <w:rPr>
-          <w:b/>
-        </w:rPr>
-        <w:t>Calculate</w:t>
-      </w:r>
-      <w:r>
-        <w:t xml:space="preserve"> or </w:t>
-      </w:r>
-      <w:r>
-        <w:rPr>
-          <w:b/>
-        </w:rPr>
-        <w:t>Cancel</w:t>
-      </w:r>
-      <w:r>
-        <w:t>.</w:t>
-      </w:r>
-    </w:p>
-    <w:p>
-      <w:pPr>
-        <w:rPr>
-          <w:rFonts w:hint="eastAsia"/>
-        </w:rPr>
-      </w:pPr>
-      <w:r>
-        <w:t>Enter:</w:t>
+        <w:t>The New Stage dialog is modal. Other VesselPlanner windows cannot be used until you finish or cancel the stage.</w:t>
+      </w:r>
+    </w:p>
+    <w:p>
+      <w:pPr>
+        <w:rPr>
+          <w:rFonts w:hint="eastAsia"/>
+        </w:rPr>
+      </w:pPr>
+      <w:r>
+        <w:t>First choose the Stage type:</w:t>
       </w:r>
     </w:p>
     <w:p>
@@ -3551,10 +3178,7 @@
         </w:rPr>
       </w:pPr>
       <w:r>
-        <w:rPr>
-          <w:b/>
-        </w:rPr>
-        <w:t>Target Δv</w:t>
+        <w:t>Engines &amp; Tanks — sizes a normal propulsion stage with the delta-v/TWR engine-and-tank solver.</w:t>
       </w:r>
     </w:p>
     <w:p>
@@ -3565,10 +3189,17 @@
         </w:rPr>
       </w:pPr>
       <w:r>
-        <w:rPr>
-          <w:b/>
-        </w:rPr>
-        <w:t>Δv basis</w:t>
+        <w:t>Subassemblies — creates a stage from one or more saved KSP subassemblies without opening the engine/tank solver.</w:t>
+      </w:r>
+    </w:p>
+    <w:p>
+      <w:pPr>
+        <w:rPr>
+          <w:rFonts w:hint="eastAsia"/>
+        </w:rPr>
+      </w:pPr>
+      <w:r>
+        <w:t>For Engines &amp; Tanks, enter:</w:t>
       </w:r>
     </w:p>
     <w:p>
@@ -3579,10 +3210,7 @@
         </w:rPr>
       </w:pPr>
       <w:r>
-        <w:rPr>
-          <w:b/>
-        </w:rPr>
-        <w:t>Minimum TWR</w:t>
+        <w:t>Target Δv and Δv basis</w:t>
       </w:r>
     </w:p>
     <w:p>
@@ -3593,23 +3221,14 @@
         </w:rPr>
       </w:pPr>
       <w:r>
-        <w:rPr>
-          <w:b/>
-        </w:rPr>
-        <w:t>Max engines</w:t>
+        <w:t>Minimum TWR and Max engines</w:t>
       </w:r>
     </w:p>
     <w:p>
       <w:pPr>
         <w:pStyle w:val="ListBullet"/>
-        <w:rPr>
-          <w:rFonts w:hint="eastAsia"/>
-        </w:rPr>
-      </w:pPr>
-      <w:r>
-        <w:rPr>
-          <w:b/>
-        </w:rPr>
+      </w:pPr>
+      <w:r>
         <w:t>Additional Cargo Mass</w:t>
       </w:r>
     </w:p>
@@ -3621,7 +3240,7 @@
         </w:rPr>
       </w:pPr>
       <w:r>
-        <w:t>Add decoupler mass</w:t>
+        <w:t>Add decoupler mass; booster layout (Side Boosters; Core burns too below it; conditional Radial decouplers below that)</w:t>
       </w:r>
     </w:p>
     <w:p>
@@ -3632,59 +3251,56 @@
         </w:rPr>
       </w:pPr>
       <w:r>
-        <w:t xml:space="preserve">optional </w:t>
-      </w:r>
-      <w:r>
-        <w:rPr>
-          <w:b/>
-        </w:rPr>
-        <w:t>Bulkhead profiles</w:t>
-      </w:r>
-    </w:p>
-    <w:p>
-      <w:pPr>
-        <w:rPr>
-          <w:rFonts w:hint="eastAsia"/>
-        </w:rPr>
-      </w:pPr>
-      <w:r>
-        <w:rPr>
-          <w:b/>
-        </w:rPr>
-        <w:t>Additional Cargo Mass</w:t>
-      </w:r>
-      <w:r>
-        <w:t xml:space="preserve"> is non-propellant dry mass carried by that stage. It is separate from the vessel payload.</w:t>
-      </w:r>
-    </w:p>
-    <w:p>
-      <w:pPr>
-        <w:rPr>
-          <w:rFonts w:hint="eastAsia"/>
-        </w:rPr>
-      </w:pPr>
-      <w:r>
-        <w:t>When Add decoupler mass is enabled, VesselPlanner adds the configured decoupler mass for the selected stack profile to the stage fixed dry mass. The values come from GameData/VesselPlanner/decouplerMasses.cfg. If several matching stack profiles are selected, the largest matching decoupler mass is used.</w:t>
-      </w:r>
-    </w:p>
-    <w:p>
-      <w:pPr>
-        <w:rPr>
-          <w:rFonts w:hint="eastAsia"/>
-        </w:rPr>
-      </w:pPr>
-      <w:r>
-        <w:t>For Stage 2 and later, the dialog shows Previous stages mass. This is the original plan payload plus the full wet mass of all previously planned stages, and VesselPlanner automatically uses it as the payload for the current stage.</w:t>
-      </w:r>
-    </w:p>
-    <w:p>
-      <w:pPr>
-        <w:rPr>
-          <w:rFonts w:hint="eastAsia"/>
-        </w:rPr>
-      </w:pPr>
-      <w:r>
-        <w:t>Tab moves through the numeric entry fields; Shift+Tab moves backward.</w:t>
+        <w:t>optional Bulkhead profiles</w:t>
+      </w:r>
+    </w:p>
+    <w:p>
+      <w:pPr/>
+      <w:r>
+        <w:t>Mission-linked stages now match their Mission Planner step type. An Engines &amp; Tanks step opens the normal propulsion-stage editor and contains no mission subassemblies. A Subassemblies step opens the Subassemblies editor with all of that step's saved subassemblies, Counts, and Decoupler selections preloaded.</w:t>
+      </w:r>
+    </w:p>
+    <w:p>
+      <w:pPr>
+        <w:rPr>
+          <w:rFonts w:hint="eastAsia"/>
+        </w:rPr>
+      </w:pPr>
+      <w:r>
+        <w:t>In Subassemblies mode, use the Available subassemblies list to add one or more saved subassemblies. Each added line has its own Count field and Decoupler toggle. The count must be a whole number greater than zero. If Decoupler is enabled, the same number of decouplers is included as subassemblies on that line. The Subassemblies New/Edit Stage window is taller so the Stage mass and Add Stage/Save Stage/Cancel controls remain fully visible beneath the two lists.</w:t>
+      </w:r>
+      <w:r>
+        <w:t xml:space="preserve"> The dialog reserves enough bottom space to keep the validation/status line fully visible even when no subassembly has been selected yet.</w:t>
+      </w:r>
+    </w:p>
+    <w:p>
+      <w:pPr>
+        <w:rPr>
+          <w:rFonts w:hint="eastAsia"/>
+        </w:rPr>
+      </w:pPr>
+      <w:r>
+        <w:t>Decoupler reference masses come from GameData/VesselPlanner/decouplerMasses.cfg. Engines &amp; Tanks stages use the selected stage bulkhead profiles. Core burns too is shown on the line below Side Boosters; conditional Radial decouplers is below that. These choices are saved with the stage. Subassemblies stages use each saved subassembly root part bulkhead profile(s), choosing the largest matching configured mass when more than one profile applies.</w:t>
+      </w:r>
+    </w:p>
+    <w:p>
+      <w:pPr>
+        <w:rPr>
+          <w:rFonts w:hint="eastAsia"/>
+        </w:rPr>
+      </w:pPr>
+      <w:r>
+        <w:t>For Stage 2 and later, the dialog shows Previous stages mass. This is the original plan payload plus the complete wet mass of all previously planned stages, whether those are Engines &amp; Tanks stages or Subassemblies stages with counted hardware and selected per-copy decouplers.</w:t>
+      </w:r>
+    </w:p>
+    <w:p>
+      <w:pPr>
+        <w:rPr>
+          <w:rFonts w:hint="eastAsia"/>
+        </w:rPr>
+      </w:pPr>
+      <w:r>
+        <w:t>In Engines &amp; Tanks mode, Tab moves through the numeric entry fields; Shift+Tab moves backward.</w:t>
       </w:r>
     </w:p>
     <w:tbl>
@@ -3726,62 +3342,9 @@
             <w:r>
               <w:rPr>
                 <w:b/>
-                <w:noProof/>
-                <w:color w:val="58636E"/>
-                <w:sz w:val="22"/>
+                <w:i/>
               </w:rPr>
-              <w:lastRenderedPageBreak/>
-              <w:drawing>
-                <wp:inline distT="0" distB="0" distL="0" distR="0" wp14:anchorId="42F78320" wp14:editId="33C17151">
-                  <wp:extent cx="5142857" cy="4705714"/>
-                  <wp:effectExtent l="0" t="0" r="1270" b="0"/>
-                  <wp:docPr id="1346041388" name="Picture 9"/>
-                  <wp:cNvGraphicFramePr>
-                    <a:graphicFrameLocks xmlns:a="http://schemas.openxmlformats.org/drawingml/2006/main" noChangeAspect="1"/>
-                  </wp:cNvGraphicFramePr>
-                  <a:graphic xmlns:a="http://schemas.openxmlformats.org/drawingml/2006/main">
-                    <a:graphicData uri="http://schemas.openxmlformats.org/drawingml/2006/picture">
-                      <pic:pic xmlns:pic="http://schemas.openxmlformats.org/drawingml/2006/picture">
-                        <pic:nvPicPr>
-                          <pic:cNvPr id="1346041388" name="Picture 1346041388"/>
-                          <pic:cNvPicPr/>
-                        </pic:nvPicPr>
-                        <pic:blipFill>
-                          <a:blip r:embed="rId15"/>
-                          <a:stretch>
-                            <a:fillRect/>
-                          </a:stretch>
-                        </pic:blipFill>
-                        <pic:spPr>
-                          <a:xfrm>
-                            <a:off x="0" y="0"/>
-                            <a:ext cx="5142857" cy="4705714"/>
-                          </a:xfrm>
-                          <a:prstGeom prst="rect">
-                            <a:avLst/>
-                          </a:prstGeom>
-                        </pic:spPr>
-                      </pic:pic>
-                    </a:graphicData>
-                  </a:graphic>
-                </wp:inline>
-              </w:drawing>
-            </w:r>
-            <w:r>
-              <w:rPr>
-                <w:b/>
-                <w:color w:val="58636E"/>
-                <w:sz w:val="22"/>
-              </w:rPr>
-              <w:br/>
-            </w:r>
-            <w:r>
-              <w:rPr>
-                <w:i/>
-                <w:color w:val="646C74"/>
-                <w:sz w:val="20"/>
-              </w:rPr>
-              <w:t>New Stage dialog with all entry fields visible</w:t>
+              <w:t>[IMAGE PLACEHOLDER: New Stage dialog with all entry fields visible]</w:t>
             </w:r>
           </w:p>
         </w:tc>
@@ -3810,7 +3373,7 @@
         </w:rPr>
       </w:pPr>
       <w:r>
-        <w:t>VesselPlanner presets the Bulkhead Profiles selection when New Stage opens. For the first stage, an existing editor vessel uses its open lower bottom node, falling back to the top node. For later stages, the previous stage engine bottom node is used, falling back to its top node. You can then change the selection as needed.</w:t>
+        <w:t>VesselPlanner presets the Bulkhead Profiles selection when New Stage opens. For the first stage, an existing editor vessel uses its open lower bottom node, falling back to the top node. For later stages, the previous stage engine bottom node is used, falling back to its top node. Click Bulkhead profiles to expand the original inline scrolling multi-select list. An automatic profile is only a preset: the first different profile you manually select replaces that preset, so one manual selection is honored by itself. Further manual selections can intentionally add more profiles. The list stays open while selections are changed. Choose Clear selection to remove all profile restrictions and consider every profile.</w:t>
       </w:r>
     </w:p>
     <w:p>
@@ -3860,17 +3423,14 @@
         </w:rPr>
       </w:pPr>
       <w:r>
-        <w:t xml:space="preserve">The selected profiles filter </w:t>
+        <w:t>The selected profiles filter both engine candidates and tank-set suggestions for that stage. Every mixed tank set uses only tank types that share one of the allowed profiles.</w:t>
       </w:r>
       <w:r>
         <w:rPr>
           <w:b/>
         </w:rPr>
-        <w:t>both engine candidates and tank suggestions</w:t>
-      </w:r>
-      <w:r>
-        <w:t xml:space="preserve"> for that stage.</w:t>
-      </w:r>
+      </w:r>
+      <w:r/>
     </w:p>
     <w:p>
       <w:pPr>
@@ -3914,7 +3474,7 @@
         <w:pStyle w:val="Heading3"/>
       </w:pPr>
       <w:r>
-        <w:t>Step 5 — Select an engine and tank</w:t>
+        <w:t>Step 5 — Select an engine and tank set</w:t>
       </w:r>
     </w:p>
     <w:p>
@@ -3936,7 +3496,7 @@
         </w:rPr>
       </w:pPr>
       <w:r>
-        <w:t>Select a tank from the Tanks pane.</w:t>
+        <w:t>Select a tank set from the Tanks pane.</w:t>
       </w:r>
     </w:p>
     <w:p>
@@ -3969,8 +3529,7 @@
         </w:rPr>
       </w:pPr>
       <w:r>
-        <w:lastRenderedPageBreak/>
-        <w:t>the selected tank and quantity</w:t>
+        <w:t>the selected tank set and total quantity</w:t>
       </w:r>
     </w:p>
     <w:p>
@@ -4017,45 +3576,36 @@
         </w:rPr>
       </w:pPr>
       <w:r>
-        <w:t>It adds the selected engine and the selected tank quantity to the open Stage-By-Stage stage. After the add completes, the Stage-By-Stage Plan window is brought to the front.</w:t>
-      </w:r>
-    </w:p>
-    <w:p>
-      <w:pPr>
-        <w:rPr>
-          <w:rFonts w:hint="eastAsia"/>
-        </w:rPr>
-      </w:pPr>
-      <w:r>
-        <w:t xml:space="preserve">You can also use the individual </w:t>
+        <w:t>For an Engines &amp; Tanks stage, the stage list shows every selected tank type and count, then the optional stage decoupler, and selected engines. Each engine and tank row includes a small thumbnail of the KSP part immediately before the engine/tank label. VesselPlanner renders these thumbnails off-screen and constructs the transparency explicitly so KSP editor-icon shader alpha behavior does not make the thumbnails invisible. The stage summary also shows any Side Boosters, Core burns too, and Radial decouplers layout flags. A Subassemblies stage shows each saved subassembly with its quantity and mass; when that line has Decoupler enabled, a matching decoupler row is shown with the same quantity. All completed stage mass is carried by every lower stage.</w:t>
+      </w:r>
+    </w:p>
+    <w:p>
+      <w:pPr>
+        <w:rPr>
+          <w:rFonts w:hint="eastAsia"/>
+        </w:rPr>
+      </w:pPr>
+      <w:r>
+        <w:t>You can also use the individual Add and Add Engine controls, plus Add to Stage on a tank suggestion while the Stage-By-Stage stage is open.</w:t>
       </w:r>
       <w:r>
         <w:rPr>
           <w:b/>
         </w:rPr>
-        <w:t>Add</w:t>
-      </w:r>
-      <w:r>
-        <w:t xml:space="preserve">, </w:t>
-      </w:r>
+      </w:r>
+      <w:r/>
       <w:r>
         <w:rPr>
           <w:b/>
         </w:rPr>
-        <w:t>Add Engine</w:t>
-      </w:r>
-      <w:r>
-        <w:t xml:space="preserve">, and </w:t>
-      </w:r>
+      </w:r>
+      <w:r/>
       <w:r>
         <w:rPr>
           <w:b/>
         </w:rPr>
-        <w:t>Add Tank</w:t>
-      </w:r>
-      <w:r>
-        <w:t xml:space="preserve"> controls.</w:t>
-      </w:r>
+      </w:r>
+      <w:r/>
     </w:p>
     <w:tbl>
       <w:tblPr>
@@ -4096,62 +3646,9 @@
             <w:r>
               <w:rPr>
                 <w:b/>
-                <w:noProof/>
-                <w:color w:val="58636E"/>
-                <w:sz w:val="22"/>
+                <w:i/>
               </w:rPr>
-              <w:lastRenderedPageBreak/>
-              <w:drawing>
-                <wp:inline distT="0" distB="0" distL="0" distR="0" wp14:anchorId="6CF4D565" wp14:editId="199568B2">
-                  <wp:extent cx="5897880" cy="6952615"/>
-                  <wp:effectExtent l="0" t="0" r="7620" b="635"/>
-                  <wp:docPr id="1210275332" name="Picture 10"/>
-                  <wp:cNvGraphicFramePr>
-                    <a:graphicFrameLocks xmlns:a="http://schemas.openxmlformats.org/drawingml/2006/main" noChangeAspect="1"/>
-                  </wp:cNvGraphicFramePr>
-                  <a:graphic xmlns:a="http://schemas.openxmlformats.org/drawingml/2006/main">
-                    <a:graphicData uri="http://schemas.openxmlformats.org/drawingml/2006/picture">
-                      <pic:pic xmlns:pic="http://schemas.openxmlformats.org/drawingml/2006/picture">
-                        <pic:nvPicPr>
-                          <pic:cNvPr id="1210275332" name="Picture 1210275332"/>
-                          <pic:cNvPicPr/>
-                        </pic:nvPicPr>
-                        <pic:blipFill>
-                          <a:blip r:embed="rId16"/>
-                          <a:stretch>
-                            <a:fillRect/>
-                          </a:stretch>
-                        </pic:blipFill>
-                        <pic:spPr>
-                          <a:xfrm>
-                            <a:off x="0" y="0"/>
-                            <a:ext cx="5897880" cy="6952615"/>
-                          </a:xfrm>
-                          <a:prstGeom prst="rect">
-                            <a:avLst/>
-                          </a:prstGeom>
-                        </pic:spPr>
-                      </pic:pic>
-                    </a:graphicData>
-                  </a:graphic>
-                </wp:inline>
-              </w:drawing>
-            </w:r>
-            <w:r>
-              <w:rPr>
-                <w:b/>
-                <w:color w:val="58636E"/>
-                <w:sz w:val="22"/>
-              </w:rPr>
-              <w:br/>
-            </w:r>
-            <w:r>
-              <w:rPr>
-                <w:i/>
-                <w:color w:val="646C74"/>
-                <w:sz w:val="20"/>
-              </w:rPr>
-              <w:t>Stage-By-Stage stage after engine and tanks have been added</w:t>
+              <w:t>[IMAGE PLACEHOLDER: Stage-By-Stage stage after engine and tanks have been added]</w:t>
             </w:r>
           </w:p>
         </w:tc>
@@ -4191,13 +3688,35 @@
         </w:rPr>
       </w:pPr>
       <w:r>
+        <w:t>Done — close the currently open Engines &amp; Tanks stage without finalizing the complete plan.</w:t>
+      </w:r>
+    </w:p>
+    <w:p>
+      <w:pPr>
+        <w:pStyle w:val="ListBullet"/>
+        <w:rPr>
+          <w:rFonts w:hint="eastAsia"/>
+        </w:rPr>
+      </w:pPr>
+      <w:r>
+        <w:t>Edit — reopen a stage. You may change its stage type; changing from Engines &amp; Tanks to Subassemblies (or back) replaces the existing stage contents when the revised stage is saved/calculated.</w:t>
+      </w:r>
+    </w:p>
+    <w:p>
+      <w:pPr>
+        <w:pStyle w:val="ListBullet"/>
+        <w:rPr>
+          <w:rFonts w:hint="eastAsia"/>
+        </w:rPr>
+      </w:pPr>
+      <w:r>
         <w:rPr>
           <w:b/>
         </w:rPr>
-        <w:t>Done</w:t>
-      </w:r>
-      <w:r>
-        <w:t xml:space="preserve"> — close the currently open stage without finalizing the complete plan.</w:t>
+        <w:t>Delete</w:t>
+      </w:r>
+      <w:r>
+        <w:t xml:space="preserve"> — remove a stage from the plan.</w:t>
       </w:r>
     </w:p>
     <w:p>
@@ -4208,48 +3727,7 @@
         </w:rPr>
       </w:pPr>
       <w:r>
-        <w:rPr>
-          <w:b/>
-        </w:rPr>
-        <w:t>Edit</w:t>
-      </w:r>
-      <w:r>
-        <w:t xml:space="preserve"> — reopen the stage requirements and recalculate while keeping the selected parts.</w:t>
-      </w:r>
-    </w:p>
-    <w:p>
-      <w:pPr>
-        <w:pStyle w:val="ListBullet"/>
-        <w:rPr>
-          <w:rFonts w:hint="eastAsia"/>
-        </w:rPr>
-      </w:pPr>
-      <w:r>
-        <w:rPr>
-          <w:b/>
-        </w:rPr>
-        <w:t>Delete</w:t>
-      </w:r>
-      <w:r>
-        <w:t xml:space="preserve"> — remove a stage from the plan.</w:t>
-      </w:r>
-    </w:p>
-    <w:p>
-      <w:pPr>
-        <w:pStyle w:val="ListBullet"/>
-        <w:rPr>
-          <w:rFonts w:hint="eastAsia"/>
-        </w:rPr>
-      </w:pPr>
-      <w:r>
-        <w:rPr>
-          <w:b/>
-        </w:rPr>
-        <w:lastRenderedPageBreak/>
-        <w:t>Remove</w:t>
-      </w:r>
-      <w:r>
-        <w:t xml:space="preserve"> — remove an individual planned part.</w:t>
+        <w:t>Remove — remove an individual planned engine/tank part from an Engines &amp; Tanks stage.</w:t>
       </w:r>
     </w:p>
     <w:p>
@@ -4397,16 +3875,74 @@
         </w:rPr>
       </w:pPr>
       <w:r>
-        <w:t xml:space="preserve">Each planned part receives an </w:t>
+        <w:t>Planned engine/tank parts receive an Add button for placing them in the editor. Subassembly stages remain listed with their counts and decouplers and are placed using KSP's normal saved-subassembly workflow.</w:t>
+      </w:r>
+    </w:p>
+    <w:p>
+      <w:pPr>
+        <w:pStyle w:val="ListBullet"/>
+        <w:rPr>
+          <w:rFonts w:hint="eastAsia"/>
+        </w:rPr>
+      </w:pPr>
+      <w:r>
+        <w:t>The main planner closes so the plan can be used as a build list.</w:t>
+      </w:r>
+    </w:p>
+    <w:p>
+      <w:pPr>
+        <w:rPr>
+          <w:rFonts w:hint="eastAsia"/>
+        </w:rPr>
+      </w:pPr>
+      <w:r>
+        <w:t xml:space="preserve">Use </w:t>
       </w:r>
       <w:r>
         <w:rPr>
           <w:b/>
         </w:rPr>
-        <w:t>Add</w:t>
-      </w:r>
-      <w:r>
-        <w:t xml:space="preserve"> button for placing it in the editor.</w:t>
+        <w:t>Reopen</w:t>
+      </w:r>
+      <w:r>
+        <w:t xml:space="preserve"> if you need to edit the plan again.</w:t>
+      </w:r>
+    </w:p>
+    <w:p>
+      <w:pPr>
+        <w:pStyle w:val="Heading3"/>
+      </w:pPr>
+      <w:r>
+        <w:t>Loading a saved plan</w:t>
+      </w:r>
+    </w:p>
+    <w:p>
+      <w:pPr>
+        <w:rPr>
+          <w:rFonts w:hint="eastAsia"/>
+        </w:rPr>
+      </w:pPr>
+      <w:r>
+        <w:t xml:space="preserve">Click </w:t>
+      </w:r>
+      <w:r>
+        <w:rPr>
+          <w:b/>
+        </w:rPr>
+        <w:t>Load</w:t>
+      </w:r>
+      <w:r>
+        <w:t xml:space="preserve"> to open the saved-plan list.</w:t>
+      </w:r>
+    </w:p>
+    <w:p>
+      <w:pPr>
+        <w:rPr>
+          <w:rFonts w:hint="eastAsia"/>
+        </w:rPr>
+      </w:pPr>
+      <w:r>
+        <w:t>You can:</w:t>
       </w:r>
     </w:p>
     <w:p>
@@ -4417,63 +3953,7 @@
         </w:rPr>
       </w:pPr>
       <w:r>
-        <w:t>The main planner closes so the plan can be used as a build list.</w:t>
-      </w:r>
-    </w:p>
-    <w:p>
-      <w:pPr>
-        <w:rPr>
-          <w:rFonts w:hint="eastAsia"/>
-        </w:rPr>
-      </w:pPr>
-      <w:r>
-        <w:t xml:space="preserve">Use </w:t>
-      </w:r>
-      <w:r>
-        <w:rPr>
-          <w:b/>
-        </w:rPr>
-        <w:t>Reopen</w:t>
-      </w:r>
-      <w:r>
-        <w:t xml:space="preserve"> if you need to edit the plan again.</w:t>
-      </w:r>
-    </w:p>
-    <w:p>
-      <w:pPr>
-        <w:pStyle w:val="Heading3"/>
-      </w:pPr>
-      <w:r>
-        <w:t>Loading a saved plan</w:t>
-      </w:r>
-    </w:p>
-    <w:p>
-      <w:pPr>
-        <w:rPr>
-          <w:rFonts w:hint="eastAsia"/>
-        </w:rPr>
-      </w:pPr>
-      <w:r>
-        <w:t xml:space="preserve">Click </w:t>
-      </w:r>
-      <w:r>
-        <w:rPr>
-          <w:b/>
-        </w:rPr>
-        <w:t>Load</w:t>
-      </w:r>
-      <w:r>
-        <w:t xml:space="preserve"> to open the saved-plan list.</w:t>
-      </w:r>
-    </w:p>
-    <w:p>
-      <w:pPr>
-        <w:rPr>
-          <w:rFonts w:hint="eastAsia"/>
-        </w:rPr>
-      </w:pPr>
-      <w:r>
-        <w:t>You can:</w:t>
+        <w:t>load a plan</w:t>
       </w:r>
     </w:p>
     <w:p>
@@ -4484,17 +3964,6 @@
         </w:rPr>
       </w:pPr>
       <w:r>
-        <w:t>load a plan</w:t>
-      </w:r>
-    </w:p>
-    <w:p>
-      <w:pPr>
-        <w:pStyle w:val="ListBullet"/>
-        <w:rPr>
-          <w:rFonts w:hint="eastAsia"/>
-        </w:rPr>
-      </w:pPr>
-      <w:r>
         <w:t>delete a saved plan</w:t>
       </w:r>
     </w:p>
@@ -4521,7 +3990,7 @@
         <w:pStyle w:val="Heading2"/>
       </w:pPr>
       <w:r>
-        <w:t>8. Editor Settings</w:t>
+        <w:t>9. Editor Settings</w:t>
       </w:r>
     </w:p>
     <w:p>
@@ -4644,62 +4113,9 @@
             <w:r>
               <w:rPr>
                 <w:b/>
-                <w:noProof/>
-                <w:color w:val="58636E"/>
-                <w:sz w:val="22"/>
+                <w:i/>
               </w:rPr>
-              <w:lastRenderedPageBreak/>
-              <w:drawing>
-                <wp:inline distT="0" distB="0" distL="0" distR="0" wp14:anchorId="7C02B2E6" wp14:editId="0C9154B7">
-                  <wp:extent cx="5897880" cy="6684645"/>
-                  <wp:effectExtent l="0" t="0" r="7620" b="1905"/>
-                  <wp:docPr id="1319191808" name="Picture 11"/>
-                  <wp:cNvGraphicFramePr>
-                    <a:graphicFrameLocks xmlns:a="http://schemas.openxmlformats.org/drawingml/2006/main" noChangeAspect="1"/>
-                  </wp:cNvGraphicFramePr>
-                  <a:graphic xmlns:a="http://schemas.openxmlformats.org/drawingml/2006/main">
-                    <a:graphicData uri="http://schemas.openxmlformats.org/drawingml/2006/picture">
-                      <pic:pic xmlns:pic="http://schemas.openxmlformats.org/drawingml/2006/picture">
-                        <pic:nvPicPr>
-                          <pic:cNvPr id="1319191808" name="Picture 1319191808"/>
-                          <pic:cNvPicPr/>
-                        </pic:nvPicPr>
-                        <pic:blipFill>
-                          <a:blip r:embed="rId17"/>
-                          <a:stretch>
-                            <a:fillRect/>
-                          </a:stretch>
-                        </pic:blipFill>
-                        <pic:spPr>
-                          <a:xfrm>
-                            <a:off x="0" y="0"/>
-                            <a:ext cx="5897880" cy="6684645"/>
-                          </a:xfrm>
-                          <a:prstGeom prst="rect">
-                            <a:avLst/>
-                          </a:prstGeom>
-                        </pic:spPr>
-                      </pic:pic>
-                    </a:graphicData>
-                  </a:graphic>
-                </wp:inline>
-              </w:drawing>
-            </w:r>
-            <w:r>
-              <w:rPr>
-                <w:b/>
-                <w:color w:val="58636E"/>
-                <w:sz w:val="22"/>
-              </w:rPr>
-              <w:br/>
-            </w:r>
-            <w:r>
-              <w:rPr>
-                <w:i/>
-                <w:color w:val="646C74"/>
-                <w:sz w:val="20"/>
-              </w:rPr>
-              <w:t>Editor Settings window</w:t>
+              <w:t>[IMAGE PLACEHOLDER: Editor Settings window]</w:t>
             </w:r>
           </w:p>
         </w:tc>
@@ -4784,7 +4200,6 @@
         </w:rPr>
       </w:pPr>
       <w:r>
-        <w:lastRenderedPageBreak/>
         <w:t>You can also choose whether the planner closes after a successful engine Add operation.</w:t>
       </w:r>
     </w:p>
@@ -4811,6 +4226,20 @@
         <w:pStyle w:val="Heading3"/>
       </w:pPr>
       <w:r>
+        <w:t>Filters</w:t>
+      </w:r>
+    </w:p>
+    <w:p>
+      <w:pPr/>
+      <w:r>
+        <w:t>Engine and tank text filtering each have a Filter field and an Exclude field. Both accept comma-separated terms. Filter terms use OR matching; any matching Exclude term hides the candidate. Changes take effect immediately. On the Filters settings page, persistence is controlled independently by four options: Save engine include Filter, Save engine Exclude filter, Save tank include Filter, and Save tank Exclude filter. All four are enabled by default. Each field is saved automatically to VesselPlannerSettings.cfg only while its own option is enabled, and is restored independently the next session. Turning one persistence option off leaves that field's current-session text unchanged but clears only its saved value; the companion include/exclude field is unaffected. Existing 0.7.32 engine-pair and tank-pair persistence settings migrate automatically to the corresponding two per-field options.</w:t>
+      </w:r>
+    </w:p>
+    <w:p>
+      <w:pPr>
+        <w:pStyle w:val="Heading3"/>
+      </w:pPr>
+      <w:r>
         <w:t>Appearance</w:t>
       </w:r>
     </w:p>
@@ -4884,7 +4313,7 @@
         <w:pStyle w:val="Heading2"/>
       </w:pPr>
       <w:r>
-        <w:t>9. Using the Flight Graph</w:t>
+        <w:t>10. Using the Flight Graph</w:t>
       </w:r>
     </w:p>
     <w:p>
@@ -4936,61 +4365,9 @@
             <w:r>
               <w:rPr>
                 <w:b/>
-                <w:noProof/>
-                <w:color w:val="58636E"/>
-                <w:sz w:val="22"/>
+                <w:i/>
               </w:rPr>
-              <w:drawing>
-                <wp:inline distT="0" distB="0" distL="0" distR="0" wp14:anchorId="33D48DC0" wp14:editId="2F690ED7">
-                  <wp:extent cx="5897880" cy="4300220"/>
-                  <wp:effectExtent l="0" t="0" r="7620" b="5080"/>
-                  <wp:docPr id="1852500656" name="Picture 12"/>
-                  <wp:cNvGraphicFramePr>
-                    <a:graphicFrameLocks xmlns:a="http://schemas.openxmlformats.org/drawingml/2006/main" noChangeAspect="1"/>
-                  </wp:cNvGraphicFramePr>
-                  <a:graphic xmlns:a="http://schemas.openxmlformats.org/drawingml/2006/main">
-                    <a:graphicData uri="http://schemas.openxmlformats.org/drawingml/2006/picture">
-                      <pic:pic xmlns:pic="http://schemas.openxmlformats.org/drawingml/2006/picture">
-                        <pic:nvPicPr>
-                          <pic:cNvPr id="1852500656" name="Picture 1852500656"/>
-                          <pic:cNvPicPr/>
-                        </pic:nvPicPr>
-                        <pic:blipFill>
-                          <a:blip r:embed="rId18"/>
-                          <a:stretch>
-                            <a:fillRect/>
-                          </a:stretch>
-                        </pic:blipFill>
-                        <pic:spPr>
-                          <a:xfrm>
-                            <a:off x="0" y="0"/>
-                            <a:ext cx="5897880" cy="4300220"/>
-                          </a:xfrm>
-                          <a:prstGeom prst="rect">
-                            <a:avLst/>
-                          </a:prstGeom>
-                        </pic:spPr>
-                      </pic:pic>
-                    </a:graphicData>
-                  </a:graphic>
-                </wp:inline>
-              </w:drawing>
-            </w:r>
-            <w:r>
-              <w:rPr>
-                <w:b/>
-                <w:color w:val="58636E"/>
-                <w:sz w:val="22"/>
-              </w:rPr>
-              <w:br/>
-            </w:r>
-            <w:r>
-              <w:rPr>
-                <w:i/>
-                <w:color w:val="646C74"/>
-                <w:sz w:val="20"/>
-              </w:rPr>
-              <w:t>Flight telemetry graph during ascent</w:t>
+              <w:t>[IMAGE PLACEHOLDER: Flight telemetry graph during ascent]</w:t>
             </w:r>
           </w:p>
         </w:tc>
@@ -5048,7 +4425,6 @@
         </w:rPr>
       </w:pPr>
       <w:r>
-        <w:lastRenderedPageBreak/>
         <w:t>Recording starts automatically when the vessel leaves PRELAUNCH.</w:t>
       </w:r>
     </w:p>
@@ -5434,7 +4810,7 @@
         <w:pStyle w:val="Heading2"/>
       </w:pPr>
       <w:r>
-        <w:t>10. Flight Settings and Export</w:t>
+        <w:t>11. Flight Settings and Export</w:t>
       </w:r>
     </w:p>
     <w:p>
@@ -5495,62 +4871,9 @@
             <w:r>
               <w:rPr>
                 <w:b/>
-                <w:noProof/>
-                <w:color w:val="58636E"/>
-                <w:sz w:val="22"/>
+                <w:i/>
               </w:rPr>
-              <w:lastRenderedPageBreak/>
-              <w:drawing>
-                <wp:inline distT="0" distB="0" distL="0" distR="0" wp14:anchorId="08F18E50" wp14:editId="229C6760">
-                  <wp:extent cx="5897880" cy="7455535"/>
-                  <wp:effectExtent l="0" t="0" r="7620" b="0"/>
-                  <wp:docPr id="493261975" name="Picture 13"/>
-                  <wp:cNvGraphicFramePr>
-                    <a:graphicFrameLocks xmlns:a="http://schemas.openxmlformats.org/drawingml/2006/main" noChangeAspect="1"/>
-                  </wp:cNvGraphicFramePr>
-                  <a:graphic xmlns:a="http://schemas.openxmlformats.org/drawingml/2006/main">
-                    <a:graphicData uri="http://schemas.openxmlformats.org/drawingml/2006/picture">
-                      <pic:pic xmlns:pic="http://schemas.openxmlformats.org/drawingml/2006/picture">
-                        <pic:nvPicPr>
-                          <pic:cNvPr id="493261975" name="Picture 493261975"/>
-                          <pic:cNvPicPr/>
-                        </pic:nvPicPr>
-                        <pic:blipFill>
-                          <a:blip r:embed="rId19"/>
-                          <a:stretch>
-                            <a:fillRect/>
-                          </a:stretch>
-                        </pic:blipFill>
-                        <pic:spPr>
-                          <a:xfrm>
-                            <a:off x="0" y="0"/>
-                            <a:ext cx="5897880" cy="7455535"/>
-                          </a:xfrm>
-                          <a:prstGeom prst="rect">
-                            <a:avLst/>
-                          </a:prstGeom>
-                        </pic:spPr>
-                      </pic:pic>
-                    </a:graphicData>
-                  </a:graphic>
-                </wp:inline>
-              </w:drawing>
-            </w:r>
-            <w:r>
-              <w:rPr>
-                <w:b/>
-                <w:color w:val="58636E"/>
-                <w:sz w:val="22"/>
-              </w:rPr>
-              <w:br/>
-            </w:r>
-            <w:r>
-              <w:rPr>
-                <w:i/>
-                <w:color w:val="646C74"/>
-                <w:sz w:val="20"/>
-              </w:rPr>
-              <w:t>Flight Settings window showing Plot, Sensor, Max, and Units columns</w:t>
+              <w:t>[IMAGE PLACEHOLDER: Flight Settings window showing Plot, Sensor, Max, and Units columns]</w:t>
             </w:r>
           </w:p>
         </w:tc>
@@ -5593,7 +4916,6 @@
         <w:pStyle w:val="Heading3"/>
       </w:pPr>
       <w:r>
-        <w:lastRenderedPageBreak/>
         <w:t>CSV export</w:t>
       </w:r>
     </w:p>
@@ -5816,7 +5138,7 @@
         <w:pStyle w:val="Heading2"/>
       </w:pPr>
       <w:r>
-        <w:t>11. Important Calculation Notes</w:t>
+        <w:t>12. Important Calculation Notes</w:t>
       </w:r>
     </w:p>
     <w:p>
@@ -5912,17 +5234,14 @@
         </w:rPr>
       </w:pPr>
       <w:r>
-        <w:t xml:space="preserve">Planning estimates tank dry mass with the </w:t>
+        <w:t>Planning estimates tank dry mass with the tank structural ratio until an actual tank set is chosen. Tank suggestions may combine up to three different tank types, but all types in a set must share the same KSP bulkhead profile.</w:t>
       </w:r>
       <w:r>
         <w:rPr>
           <w:b/>
         </w:rPr>
-        <w:t>tank structural ratio</w:t>
-      </w:r>
-      <w:r>
-        <w:t xml:space="preserve"> until an actual tank choice is made.</w:t>
-      </w:r>
+      </w:r>
+      <w:r/>
     </w:p>
     <w:p>
       <w:pPr>
@@ -5947,7 +5266,7 @@
         <w:pStyle w:val="Heading2"/>
       </w:pPr>
       <w:r>
-        <w:t>12. Files Created by VesselPlanner</w:t>
+        <w:t>13. Files Created by VesselPlanner</w:t>
       </w:r>
     </w:p>
     <w:p>
@@ -6019,8 +5338,15 @@
         </w:rPr>
       </w:pPr>
       <w:r>
-        <w:lastRenderedPageBreak/>
         <w:t>Important files and folders include:</w:t>
+      </w:r>
+    </w:p>
+    <w:p>
+      <w:pPr/>
+      <w:r>
+        <w:t>MissionPlans/*.cfg — saved Mission Planner missions.</w:t>
+        <w:br/>
+        <w:t>DeltaVTables/*.csv — Mission Planner planet-pack body and route delta-v tables.</w:t>
       </w:r>
     </w:p>
     <w:p>
@@ -6060,40 +5386,16 @@
             <w:shd w:val="clear" w:color="auto" w:fill="F2F4F7"/>
           </w:tcPr>
           <w:p>
-            <w:pPr>
-              <w:spacing w:before="80" w:after="80"/>
-              <w:rPr>
-                <w:rFonts w:hint="eastAsia"/>
-              </w:rPr>
-            </w:pPr>
             <w:r>
-              <w:rPr>
-                <w:rFonts w:ascii="Consolas" w:hAnsi="Consolas"/>
-                <w:sz w:val="18"/>
-              </w:rPr>
               <w:t>VesselPlannerSettings.cfg          Editor and flight settings</w:t>
-            </w:r>
-            <w:r>
-              <w:rPr>
-                <w:rFonts w:ascii="Consolas" w:hAnsi="Consolas"/>
-                <w:sz w:val="18"/>
-              </w:rPr>
               <w:br/>
               <w:t>FlightSensorMaxima.tsv             Per-vessel telemetry maxima</w:t>
-            </w:r>
-            <w:r>
-              <w:rPr>
-                <w:rFonts w:ascii="Consolas" w:hAnsi="Consolas"/>
-                <w:sz w:val="18"/>
-              </w:rPr>
               <w:br/>
               <w:t>Plans/                             Saved Stage-By-Stage plans</w:t>
-            </w:r>
-            <w:r>
-              <w:rPr>
-                <w:rFonts w:ascii="Consolas" w:hAnsi="Consolas"/>
-                <w:sz w:val="18"/>
-              </w:rPr>
+              <w:br/>
+              <w:t>MissionPlans/                      Saved Mission Planner missions</w:t>
+              <w:br/>
+              <w:t>DeltaVTables/                      Planet-pack delta-v tables</w:t>
               <w:br/>
               <w:t>CSV/                               Default CSV export folder</w:t>
             </w:r>
@@ -6176,7 +5478,7 @@
         <w:pStyle w:val="Heading2"/>
       </w:pPr>
       <w:r>
-        <w:t>13. Troubleshooting</w:t>
+        <w:t>14. Troubleshooting</w:t>
       </w:r>
     </w:p>
     <w:p>
@@ -6294,7 +5596,7 @@
         </w:rPr>
       </w:pPr>
       <w:r>
-        <w:t>engine-name filters</w:t>
+        <w:t>engine Filter / Exclude terms</w:t>
       </w:r>
     </w:p>
     <w:p>
@@ -6333,6 +5635,14 @@
     <w:p>
       <w:pPr>
         <w:pStyle w:val="ListBullet"/>
+      </w:pPr>
+      <w:r>
+        <w:t>tank parts missing either a top or bottom attach node (these are intentionally excluded from tank selection)</w:t>
+      </w:r>
+    </w:p>
+    <w:p>
+      <w:pPr>
+        <w:pStyle w:val="ListBullet"/>
         <w:rPr>
           <w:rFonts w:hint="eastAsia"/>
         </w:rPr>
@@ -6391,7 +5701,7 @@
         <w:pStyle w:val="Heading2"/>
       </w:pPr>
       <w:r>
-        <w:t>14. License</w:t>
+        <w:t>15. License</w:t>
       </w:r>
     </w:p>
     <w:p>
@@ -6413,13 +5723,6 @@
       <w:r>
         <w:t xml:space="preserve"> for license information.</w:t>
       </w:r>
-    </w:p>
-    <w:p>
-      <w:pPr>
-        <w:rPr>
-          <w:rFonts w:hint="eastAsia"/>
-        </w:rPr>
-      </w:pPr>
     </w:p>
     <w:sectPr>
       <w:headerReference w:type="default" r:id="rId20"/>
@@ -6534,24 +5837,16 @@
             </w:rPr>
             <w:t xml:space="preserve">Page </w:t>
           </w:r>
-          <w:r>
-            <w:fldChar w:fldCharType="begin"/>
-          </w:r>
-          <w:r>
-            <w:instrText>PAGE</w:instrText>
-          </w:r>
-          <w:r>
-            <w:fldChar w:fldCharType="separate"/>
-          </w:r>
+          <w:r/>
+          <w:r/>
+          <w:r/>
           <w:r>
             <w:rPr>
               <w:noProof/>
             </w:rPr>
             <w:t>1</w:t>
           </w:r>
-          <w:r>
-            <w:fldChar w:fldCharType="end"/>
-          </w:r>
+          <w:r/>
         </w:p>
       </w:tc>
     </w:tr>

</xml_diff>